<commit_message>
feat: generate final docx submission with fresh screenshots
</commit_message>
<xml_diff>
--- a/SDG4_EduTrackAI_VijayBarhate.docx
+++ b/SDG4_EduTrackAI_VijayBarhate.docx
@@ -8,7 +8,7 @@
         <w:jc w:val="center"/>
       </w:pPr>
       <w:r>
-        <w:t>Capstone Project Submission Report: EduTrack AI</w:t>
+        <w:t>EduTrack AI – SDG 4 Capstone Project</w:t>
       </w:r>
     </w:p>
     <w:p>
@@ -19,21 +19,35 @@
         <w:rPr>
           <w:b/>
         </w:rPr>
-        <w:t>Sustainable Development Goal: SDG 4 – Quality Education</w:t>
+        <w:t xml:space="preserve">Name: </w:t>
+      </w:r>
+      <w:r>
+        <w:t>Vijay Dilip Barhate</w:t>
         <w:br/>
       </w:r>
       <w:r>
         <w:rPr>
           <w:b/>
         </w:rPr>
-        <w:t>Submitted by: Vijay Barhate</w:t>
+        <w:t xml:space="preserve">Course: </w:t>
+      </w:r>
+      <w:r>
+        <w:t>B.E. Computer Engineering, Saraswati College of Engineering</w:t>
         <w:br/>
       </w:r>
       <w:r>
         <w:rPr>
           <w:b/>
         </w:rPr>
-        <w:t>Date: June 15, 2026</w:t>
+        <w:t xml:space="preserve">Date: </w:t>
+      </w:r>
+      <w:r>
+        <w:t>June 15, 2026</w:t>
+      </w:r>
+    </w:p>
+    <w:p>
+      <w:r>
+        <w:br w:type="page"/>
       </w:r>
     </w:p>
     <w:p>
@@ -45,13 +59,45 @@
       </w:r>
     </w:p>
     <w:p>
+      <w:pPr>
+        <w:pStyle w:val="ListBullet"/>
+      </w:pPr>
       <w:r>
-        <w:t>Goal 4 – Quality Education: Ensure inclusive and equitable quality education and promote lifelong learning opportunities for all.</w:t>
+        <w:rPr>
+          <w:b/>
+        </w:rPr>
+        <w:t xml:space="preserve">Selected SDG: </w:t>
+      </w:r>
+      <w:r>
+        <w:t>Goal 4 – Quality Education</w:t>
       </w:r>
     </w:p>
     <w:p>
+      <w:pPr>
+        <w:pStyle w:val="ListBullet"/>
+      </w:pPr>
       <w:r>
-        <w:t>Reason for Selection: Education is the foundation of sustainable development. However, many educational systems rely on "lagging indicators" (final grades) to identify struggling students. By the time a student fails a final exam, it is often too late for effective intervention. This issue is particularly severe in overcrowded classrooms or under-resourced schools where individual performance tracking is manual and slow. I selected SDG 4 because AI can bridge this gap by providing Early Warning Systems that identify at-risk students during the term, allowing for timely, data-driven support.</w:t>
+        <w:rPr>
+          <w:b/>
+        </w:rPr>
+        <w:t xml:space="preserve">Focus of the SDG: </w:t>
+      </w:r>
+      <w:r>
+        <w:t>SDG 4 focuses on ensuring inclusive and equitable quality education and promoting lifelong learning opportunities for all.</w:t>
+      </w:r>
+    </w:p>
+    <w:p>
+      <w:pPr>
+        <w:pStyle w:val="ListBullet"/>
+      </w:pPr>
+      <w:r>
+        <w:rPr>
+          <w:b/>
+        </w:rPr>
+        <w:t xml:space="preserve">Importance of the Issue: </w:t>
+      </w:r>
+      <w:r>
+        <w:t>Educational systems frequently fail to address performance gaps early enough. Student performance declines and attendance gaps go completely unnoticed until it is too late (e.g., after final exams), leading to preventable academic failures and course repetitions. Proactive tracking is critical to maintaining high educational quality and equity.</w:t>
       </w:r>
     </w:p>
     <w:p>
@@ -73,7 +119,7 @@
         <w:t xml:space="preserve">What is the problem?: </w:t>
       </w:r>
       <w:r>
-        <w:t>Lack of automated, real-time tracking for student academic risk, leading to high failure rates that could have been prevented with early intervention.</w:t>
+        <w:t>Teachers, students, and school administrators lack an automated early warning system for academic risk, preventing timely educational intervention.</w:t>
       </w:r>
     </w:p>
     <w:p>
@@ -87,7 +133,7 @@
         <w:t xml:space="preserve">Where does this problem exist?: </w:t>
       </w:r>
       <w:r>
-        <w:t>In schools and universities where large student-to-teacher ratios make it impossible for educators to manually analyze performance trends for every student across multiple subjects.</w:t>
+        <w:t>This issue commonly exists in schools with manual progress-tracking systems and low student-to-teacher ratios, where teachers cannot individually monitor daily performance trends across multiple subjects.</w:t>
       </w:r>
     </w:p>
     <w:p>
@@ -101,7 +147,7 @@
         <w:t xml:space="preserve">Who is affected?: </w:t>
       </w:r>
       <w:r>
-        <w:t>Primarily students at risk of academic failure, but also teachers who lack actionable insights and administrators who cannot effectively allocate support resources.</w:t>
+        <w:t>The problem directly affects students who are at risk of failing their subjects and dropping out, as well as teachers who lack the tools to perform early interventions.</w:t>
       </w:r>
     </w:p>
     <w:p>
@@ -115,21 +161,7 @@
         <w:t xml:space="preserve">Why is it serious?: </w:t>
       </w:r>
       <w:r>
-        <w:t>Academic failure leads to increased dropout rates, loss of motivation, and long-term socio-economic disadvantages, hindering the progress of SDG 4.</w:t>
-      </w:r>
-    </w:p>
-    <w:p>
-      <w:pPr>
-        <w:pStyle w:val="ListBullet"/>
-      </w:pPr>
-      <w:r>
-        <w:rPr>
-          <w:b/>
-        </w:rPr>
-        <w:t xml:space="preserve">What happens if it is not solved?: </w:t>
-      </w:r>
-      <w:r>
-        <w:t>Educational inequality will widen as students without private tutoring or individual attention continue to fall through the cracks of a reactive system.</w:t>
+        <w:t>Without early prediction, performance deficiencies compound. If not solved, this leads to increased course failure rates, higher student dropout percentages, and long-term socio-economic challenges for the affected youth.</w:t>
       </w:r>
     </w:p>
     <w:p>
@@ -146,8 +178,17 @@
       </w:r>
     </w:p>
     <w:p>
+      <w:pPr>
+        <w:pStyle w:val="ListBullet"/>
+      </w:pPr>
       <w:r>
-        <w:t>EduTrack AI is a full-stack AI platform designed to predict academic risk and automate intervention planning. It uses a Machine Learning soft-voting ensemble (Random Forest + Logistic Regression) to analyze mid-term performance data and predict the probability of failure.</w:t>
+        <w:rPr>
+          <w:b/>
+        </w:rPr>
+        <w:t xml:space="preserve">What the project is: </w:t>
+      </w:r>
+      <w:r>
+        <w:t>EduTrack AI is an intelligent educational assistant that uses machine learning to identify students at risk of academic failure.</w:t>
       </w:r>
     </w:p>
     <w:p>
@@ -158,10 +199,10 @@
         <w:rPr>
           <w:b/>
         </w:rPr>
-        <w:t xml:space="preserve">How it works: </w:t>
+        <w:t xml:space="preserve">How the system works: </w:t>
       </w:r>
       <w:r>
-        <w:t>The system ingests data like attendance rates, study hours, and mid-term marks. It processes these through a trained classifier that flags students as "High", "Medium", or "Low" risk.</w:t>
+        <w:t>The application collects early-term academic data (attendance rate, midterm marks, study hours, past history) and inputs them into a machine learning ensemble (Random Forest + Logistic Regression) that calculates the exact failure risk per subject.</w:t>
       </w:r>
     </w:p>
     <w:p>
@@ -172,10 +213,10 @@
         <w:rPr>
           <w:b/>
         </w:rPr>
-        <w:t xml:space="preserve">Intervention: </w:t>
+        <w:t xml:space="preserve">How it helps solve the problem: </w:t>
       </w:r>
       <w:r>
-        <w:t>It identifies the "Weakest Subject" for each student and uses rule-based logic to recommend a specific increase in weekly study hours (e.g., +5 hours/week) to mitigate the risk.</w:t>
+        <w:t>It flags students as High, Medium, or Low risk long before final exams, automatically triggering a personalized study plan recommendation to adjust weekly study hours for their weakest subject.</w:t>
       </w:r>
     </w:p>
     <w:p>
@@ -186,24 +227,10 @@
         <w:rPr>
           <w:b/>
         </w:rPr>
-        <w:t xml:space="preserve">Impact: </w:t>
+        <w:t xml:space="preserve">Who will use the application: </w:t>
       </w:r>
       <w:r>
-        <w:t>By converting raw data into "Actionable Insights", it shifts the educational approach from reactive (fixing failures) to proactive (preventing them).</w:t>
-      </w:r>
-    </w:p>
-    <w:p>
-      <w:pPr>
-        <w:pStyle w:val="ListBullet"/>
-      </w:pPr>
-      <w:r>
-        <w:rPr>
-          <w:b/>
-        </w:rPr>
-        <w:t xml:space="preserve">Users: </w:t>
-      </w:r>
-      <w:r>
-        <w:t>Teachers (for classroom monitoring), School Administrators (for resource allocation), and Students/Parents (for personalized study plans).</w:t>
+        <w:t>School administrators, teachers, and guidance counselors will use the dashboard for class-wide monitoring, while students and parents will receive the individual PDF performance reports.</w:t>
       </w:r>
     </w:p>
     <w:p>
@@ -225,7 +252,7 @@
         <w:t xml:space="preserve">Overview Dashboard: </w:t>
       </w:r>
       <w:r>
-        <w:t>Real-time visualization of class-wide metrics (Avg Attendance, Pass Rates) using interactive Plotly charts and KPI cards.</w:t>
+        <w:t>A high-level visual analytics panel displaying KPI cards for class pass rates and average attendance, paired with Plotly charts tracking risk distribution and subject-wise averages to help teachers monitor whole-class performance.</w:t>
       </w:r>
     </w:p>
     <w:p>
@@ -236,10 +263,10 @@
         <w:rPr>
           <w:b/>
         </w:rPr>
-        <w:t xml:space="preserve">Individual Student Lookup: </w:t>
+        <w:t xml:space="preserve">Risk Prediction Engine: </w:t>
       </w:r>
       <w:r>
-        <w:t>A detailed profile search that breaks down a student's risk probability per subject and compares their scores to class averages.</w:t>
+        <w:t>A machine learning-powered sandbox allowing users to input hypothetical attendance and score parameters to instantly calculate failure risk using a Random Forest and Logistic Regression soft-voting ensemble.</w:t>
       </w:r>
     </w:p>
     <w:p>
@@ -250,10 +277,10 @@
         <w:rPr>
           <w:b/>
         </w:rPr>
-        <w:t xml:space="preserve">Risk Prediction Sandbox: </w:t>
+        <w:t xml:space="preserve">Personalized Recommendations: </w:t>
       </w:r>
       <w:r>
-        <w:t>A simulator where teachers can input hypothetical parameters to see the predicted change in risk.</w:t>
+        <w:t>A rule-based intervention logic that automatically identifies a student's weakest subject relative to the class average and calculates the precise addition to weekly study hours needed to mitigate risk.</w:t>
       </w:r>
     </w:p>
     <w:p>
@@ -264,24 +291,10 @@
         <w:rPr>
           <w:b/>
         </w:rPr>
-        <w:t xml:space="preserve">Automated Intervention Plans: </w:t>
+        <w:t xml:space="preserve">Exportable Reports: </w:t>
       </w:r>
       <w:r>
-        <w:t>Logic-driven recommendations that pinpoint the weakest subject and prescribe a personalized study hour adjustment.</w:t>
-      </w:r>
-    </w:p>
-    <w:p>
-      <w:pPr>
-        <w:pStyle w:val="ListBullet"/>
-      </w:pPr>
-      <w:r>
-        <w:rPr>
-          <w:b/>
-        </w:rPr>
-        <w:t xml:space="preserve">Report Generation: </w:t>
-      </w:r>
-      <w:r>
-        <w:t>One-click export of student performance records into formatted PDF and CSV files.</w:t>
+        <w:t>A reporting tool that allows teachers to instantly generate and download formatted PDF progress reports and CSV raw data containing student grades, risk ratings, and custom action plans.</w:t>
       </w:r>
     </w:p>
     <w:p>
@@ -298,8 +311,120 @@
       </w:r>
     </w:p>
     <w:p>
+      <w:pPr>
+        <w:pStyle w:val="ListBullet"/>
+      </w:pPr>
       <w:r>
-        <w:t>Python (Core), FastAPI (Backend), Streamlit (Frontend), Scikit-Learn (ML), SQLite (Database), Plotly (Visualization), FPDF2 (PDF Export)</w:t>
+        <w:rPr>
+          <w:b/>
+        </w:rPr>
+        <w:t xml:space="preserve">Programming Language: </w:t>
+      </w:r>
+      <w:r>
+        <w:t>Python (Core application logic and ML modeling)</w:t>
+      </w:r>
+    </w:p>
+    <w:p>
+      <w:pPr>
+        <w:pStyle w:val="ListBullet"/>
+      </w:pPr>
+      <w:r>
+        <w:rPr>
+          <w:b/>
+        </w:rPr>
+        <w:t xml:space="preserve">Machine Learning: </w:t>
+      </w:r>
+      <w:r>
+        <w:t>Scikit-Learn (Random Forest Classifier + Logistic Regression voting ensemble, preprocessing pipelines)</w:t>
+      </w:r>
+    </w:p>
+    <w:p>
+      <w:pPr>
+        <w:pStyle w:val="ListBullet"/>
+      </w:pPr>
+      <w:r>
+        <w:rPr>
+          <w:b/>
+        </w:rPr>
+        <w:t xml:space="preserve">Backend Framework: </w:t>
+      </w:r>
+      <w:r>
+        <w:t>FastAPI (RESTful API serving prediction, data storage, and model retraining)</w:t>
+      </w:r>
+    </w:p>
+    <w:p>
+      <w:pPr>
+        <w:pStyle w:val="ListBullet"/>
+      </w:pPr>
+      <w:r>
+        <w:rPr>
+          <w:b/>
+        </w:rPr>
+        <w:t xml:space="preserve">Frontend Interface: </w:t>
+      </w:r>
+      <w:r>
+        <w:t>Streamlit (Responsive web dashboard and interactive user interface)</w:t>
+      </w:r>
+    </w:p>
+    <w:p>
+      <w:pPr>
+        <w:pStyle w:val="ListBullet"/>
+      </w:pPr>
+      <w:r>
+        <w:rPr>
+          <w:b/>
+        </w:rPr>
+        <w:t xml:space="preserve">Database: </w:t>
+      </w:r>
+      <w:r>
+        <w:t>SQLite (Local database for storing student records and tracking academic history)</w:t>
+      </w:r>
+    </w:p>
+    <w:p>
+      <w:pPr>
+        <w:pStyle w:val="ListBullet"/>
+      </w:pPr>
+      <w:r>
+        <w:rPr>
+          <w:b/>
+        </w:rPr>
+        <w:t xml:space="preserve">Data Manipulation: </w:t>
+      </w:r>
+      <w:r>
+        <w:t>Pandas and Numpy (Data engineering and processing)</w:t>
+      </w:r>
+    </w:p>
+    <w:p>
+      <w:pPr>
+        <w:pStyle w:val="ListBullet"/>
+      </w:pPr>
+      <w:r>
+        <w:rPr>
+          <w:b/>
+        </w:rPr>
+        <w:t xml:space="preserve">Visualization: </w:t>
+      </w:r>
+      <w:r>
+        <w:t>Plotly (Interactive dashboard charts)</w:t>
+      </w:r>
+    </w:p>
+    <w:p>
+      <w:pPr>
+        <w:pStyle w:val="ListBullet"/>
+      </w:pPr>
+      <w:r>
+        <w:rPr>
+          <w:b/>
+        </w:rPr>
+        <w:t xml:space="preserve">PDF Generation: </w:t>
+      </w:r>
+      <w:r>
+        <w:t>FPDF2 (Dynamic report layout and export)</w:t>
+      </w:r>
+    </w:p>
+    <w:p>
+      <w:r>
+        <w:br w:type="page"/>
       </w:r>
     </w:p>
     <w:p>
@@ -307,14 +432,22 @@
         <w:pStyle w:val="Heading1"/>
       </w:pPr>
       <w:r>
-        <w:t>6. Project Screenshots (Proof of Work)</w:t>
+        <w:t>6. Application Screenshots</w:t>
+      </w:r>
+    </w:p>
+    <w:p>
+      <w:pPr>
+        <w:pStyle w:val="Heading2"/>
+      </w:pPr>
+      <w:r>
+        <w:t>Overview Dashboard</w:t>
       </w:r>
     </w:p>
     <w:p>
       <w:r>
         <w:drawing>
           <wp:inline xmlns:a="http://schemas.openxmlformats.org/drawingml/2006/main" xmlns:pic="http://schemas.openxmlformats.org/drawingml/2006/picture">
-            <wp:extent cx="5486400" cy="7715250"/>
+            <wp:extent cx="5486400" cy="4114800"/>
             <wp:docPr id="1" name="Picture 1"/>
             <wp:cNvGraphicFramePr>
               <a:graphicFrameLocks noChangeAspect="1"/>
@@ -323,7 +456,7 @@
               <a:graphicData uri="http://schemas.openxmlformats.org/drawingml/2006/picture">
                 <pic:pic>
                   <pic:nvPicPr>
-                    <pic:cNvPr id="0" name="screenshot_1_revised.png"/>
+                    <pic:cNvPr id="0" name="overview.png"/>
                     <pic:cNvPicPr/>
                   </pic:nvPicPr>
                   <pic:blipFill>
@@ -335,7 +468,7 @@
                   <pic:spPr>
                     <a:xfrm>
                       <a:off x="0" y="0"/>
-                      <a:ext cx="5486400" cy="7715250"/>
+                      <a:ext cx="5486400" cy="4114800"/>
                     </a:xfrm>
                     <a:prstGeom prst="rect"/>
                   </pic:spPr>
@@ -347,19 +480,27 @@
       </w:r>
     </w:p>
     <w:p>
-      <w:pPr>
-        <w:jc w:val="center"/>
-      </w:pPr>
       <w:r>
-        <w:t>Figure 1: Main Overview Dashboard showing class-wide risk distribution and academic KPIs.</w:t>
+        <w:rPr>
+          <w:b/>
+        </w:rPr>
+        <w:t>EduTrack AI Overview Dashboard displaying real-time class analytics and at-risk student lists.</w:t>
       </w:r>
     </w:p>
     <w:p/>
     <w:p>
+      <w:pPr>
+        <w:pStyle w:val="Heading2"/>
+      </w:pPr>
+      <w:r>
+        <w:t>Individual Lookup</w:t>
+      </w:r>
+    </w:p>
+    <w:p>
       <w:r>
         <w:drawing>
           <wp:inline xmlns:a="http://schemas.openxmlformats.org/drawingml/2006/main" xmlns:pic="http://schemas.openxmlformats.org/drawingml/2006/picture">
-            <wp:extent cx="5486400" cy="7715250"/>
+            <wp:extent cx="5486400" cy="4114800"/>
             <wp:docPr id="2" name="Picture 2"/>
             <wp:cNvGraphicFramePr>
               <a:graphicFrameLocks noChangeAspect="1"/>
@@ -368,7 +509,7 @@
               <a:graphicData uri="http://schemas.openxmlformats.org/drawingml/2006/picture">
                 <pic:pic>
                   <pic:nvPicPr>
-                    <pic:cNvPr id="0" name="screenshot_2_revised.png"/>
+                    <pic:cNvPr id="0" name="student_lookup.png"/>
                     <pic:cNvPicPr/>
                   </pic:nvPicPr>
                   <pic:blipFill>
@@ -380,7 +521,7 @@
                   <pic:spPr>
                     <a:xfrm>
                       <a:off x="0" y="0"/>
-                      <a:ext cx="5486400" cy="7715250"/>
+                      <a:ext cx="5486400" cy="4114800"/>
                     </a:xfrm>
                     <a:prstGeom prst="rect"/>
                   </pic:spPr>
@@ -392,19 +533,27 @@
       </w:r>
     </w:p>
     <w:p>
-      <w:pPr>
-        <w:jc w:val="center"/>
-      </w:pPr>
       <w:r>
-        <w:t>Figure 2: Individual Student Performance Lookup and risk probability breakdown.</w:t>
+        <w:rPr>
+          <w:b/>
+        </w:rPr>
+        <w:t>Individual Student Lookup interface showing subject breakdown and intervention recommendations.</w:t>
       </w:r>
     </w:p>
     <w:p/>
     <w:p>
+      <w:pPr>
+        <w:pStyle w:val="Heading2"/>
+      </w:pPr>
+      <w:r>
+        <w:t>Risk Sandbox</w:t>
+      </w:r>
+    </w:p>
+    <w:p>
       <w:r>
         <w:drawing>
           <wp:inline xmlns:a="http://schemas.openxmlformats.org/drawingml/2006/main" xmlns:pic="http://schemas.openxmlformats.org/drawingml/2006/picture">
-            <wp:extent cx="5486400" cy="7715250"/>
+            <wp:extent cx="5486400" cy="4114800"/>
             <wp:docPr id="3" name="Picture 3"/>
             <wp:cNvGraphicFramePr>
               <a:graphicFrameLocks noChangeAspect="1"/>
@@ -413,11 +562,11 @@
               <a:graphicData uri="http://schemas.openxmlformats.org/drawingml/2006/picture">
                 <pic:pic>
                   <pic:nvPicPr>
-                    <pic:cNvPr id="0" name="screenshot_2_revised.png"/>
+                    <pic:cNvPr id="0" name="risk_sandbox.png"/>
                     <pic:cNvPicPr/>
                   </pic:nvPicPr>
                   <pic:blipFill>
-                    <a:blip r:embed="rId10"/>
+                    <a:blip r:embed="rId11"/>
                     <a:stretch>
                       <a:fillRect/>
                     </a:stretch>
@@ -425,7 +574,7 @@
                   <pic:spPr>
                     <a:xfrm>
                       <a:off x="0" y="0"/>
-                      <a:ext cx="5486400" cy="7715250"/>
+                      <a:ext cx="5486400" cy="4114800"/>
                     </a:xfrm>
                     <a:prstGeom prst="rect"/>
                   </pic:spPr>
@@ -437,19 +586,27 @@
       </w:r>
     </w:p>
     <w:p>
-      <w:pPr>
-        <w:jc w:val="center"/>
-      </w:pPr>
       <w:r>
-        <w:t>Figure 3: Automated Academic Intervention Plan with personalized study hour recommendations.</w:t>
+        <w:rPr>
+          <w:b/>
+        </w:rPr>
+        <w:t>Risk Prediction Sandbox for simulating student performance scenarios.</w:t>
       </w:r>
     </w:p>
     <w:p/>
     <w:p>
+      <w:pPr>
+        <w:pStyle w:val="Heading2"/>
+      </w:pPr>
+      <w:r>
+        <w:t>Dataset Manager</w:t>
+      </w:r>
+    </w:p>
+    <w:p>
       <w:r>
         <w:drawing>
           <wp:inline xmlns:a="http://schemas.openxmlformats.org/drawingml/2006/main" xmlns:pic="http://schemas.openxmlformats.org/drawingml/2006/picture">
-            <wp:extent cx="5486400" cy="7715250"/>
+            <wp:extent cx="5486400" cy="4114800"/>
             <wp:docPr id="4" name="Picture 4"/>
             <wp:cNvGraphicFramePr>
               <a:graphicFrameLocks noChangeAspect="1"/>
@@ -458,11 +615,11 @@
               <a:graphicData uri="http://schemas.openxmlformats.org/drawingml/2006/picture">
                 <pic:pic>
                   <pic:nvPicPr>
-                    <pic:cNvPr id="0" name="screenshot_6_sandbox_result.png"/>
+                    <pic:cNvPr id="0" name="dataset_manager.png"/>
                     <pic:cNvPicPr/>
                   </pic:nvPicPr>
                   <pic:blipFill>
-                    <a:blip r:embed="rId11"/>
+                    <a:blip r:embed="rId12"/>
                     <a:stretch>
                       <a:fillRect/>
                     </a:stretch>
@@ -470,7 +627,7 @@
                   <pic:spPr>
                     <a:xfrm>
                       <a:off x="0" y="0"/>
-                      <a:ext cx="5486400" cy="7715250"/>
+                      <a:ext cx="5486400" cy="4114800"/>
                     </a:xfrm>
                     <a:prstGeom prst="rect"/>
                   </pic:spPr>
@@ -482,56 +639,11 @@
       </w:r>
     </w:p>
     <w:p>
-      <w:pPr>
-        <w:jc w:val="center"/>
-      </w:pPr>
       <w:r>
-        <w:t>Figure 4: Risk Prediction Sandbox providing real-time probability gauging.</w:t>
-      </w:r>
-    </w:p>
-    <w:p/>
-    <w:p>
-      <w:r>
-        <w:drawing>
-          <wp:inline xmlns:a="http://schemas.openxmlformats.org/drawingml/2006/main" xmlns:pic="http://schemas.openxmlformats.org/drawingml/2006/picture">
-            <wp:extent cx="5486400" cy="7715250"/>
-            <wp:docPr id="5" name="Picture 5"/>
-            <wp:cNvGraphicFramePr>
-              <a:graphicFrameLocks noChangeAspect="1"/>
-            </wp:cNvGraphicFramePr>
-            <a:graphic>
-              <a:graphicData uri="http://schemas.openxmlformats.org/drawingml/2006/picture">
-                <pic:pic>
-                  <pic:nvPicPr>
-                    <pic:cNvPr id="0" name="screenshot_4_revised.png"/>
-                    <pic:cNvPicPr/>
-                  </pic:nvPicPr>
-                  <pic:blipFill>
-                    <a:blip r:embed="rId12"/>
-                    <a:stretch>
-                      <a:fillRect/>
-                    </a:stretch>
-                  </pic:blipFill>
-                  <pic:spPr>
-                    <a:xfrm>
-                      <a:off x="0" y="0"/>
-                      <a:ext cx="5486400" cy="7715250"/>
-                    </a:xfrm>
-                    <a:prstGeom prst="rect"/>
-                  </pic:spPr>
-                </pic:pic>
-              </a:graphicData>
-            </a:graphic>
-          </wp:inline>
-        </w:drawing>
-      </w:r>
-    </w:p>
-    <w:p>
-      <w:pPr>
-        <w:jc w:val="center"/>
-      </w:pPr>
-      <w:r>
-        <w:t>Figure 5: Dataset Manager for uploading CSV data and triggering automated ML model retraining.</w:t>
+        <w:rPr>
+          <w:b/>
+        </w:rPr>
+        <w:t>Dataset Manager for uploading school data and retraining the ML model ensemble.</w:t>
       </w:r>
     </w:p>
     <w:p/>
@@ -550,13 +662,12 @@
     </w:p>
     <w:p>
       <w:r>
-        <w:t>The complete source code is available on GitHub:</w:t>
-        <w:br/>
+        <w:rPr>
+          <w:b/>
+        </w:rPr>
+        <w:t xml:space="preserve">GitHub Link: </w:t>
       </w:r>
       <w:r>
-        <w:rPr>
-          <w:u w:val="single"/>
-        </w:rPr>
         <w:t>https://github.com/vijaybarhate/edutrack-ai</w:t>
       </w:r>
     </w:p>
@@ -573,7 +684,13 @@
         <w:pStyle w:val="ListBullet"/>
       </w:pPr>
       <w:r>
-        <w:t>Generative AI Integration: LLM-based tutor (e.g., Google Gemini) for subject-specific help.</w:t>
+        <w:rPr>
+          <w:b/>
+        </w:rPr>
+        <w:t xml:space="preserve">Chatbot Tutor: </w:t>
+      </w:r>
+      <w:r>
+        <w:t>Integrate a generative AI chatbot tutor using Google Gemini API to provide students with immediate, subject-specific tutoring assistance on their weakest topics.</w:t>
       </w:r>
     </w:p>
     <w:p>
@@ -581,7 +698,13 @@
         <w:pStyle w:val="ListBullet"/>
       </w:pPr>
       <w:r>
-        <w:t>Mobile Companion App: Real-time notifications for parents and students.</w:t>
+        <w:rPr>
+          <w:b/>
+        </w:rPr>
+        <w:t xml:space="preserve">Mobile Application: </w:t>
+      </w:r>
+      <w:r>
+        <w:t>Build a cross-platform mobile companion app for students and parents to view weekly progress reports and study plans on the go.</w:t>
       </w:r>
     </w:p>
     <w:p>
@@ -589,15 +712,26 @@
         <w:pStyle w:val="ListBullet"/>
       </w:pPr>
       <w:r>
-        <w:t>LMS Connector: Integration with Google Classroom and Moodle.</w:t>
+        <w:rPr>
+          <w:b/>
+        </w:rPr>
+        <w:t xml:space="preserve">LMS Integration: </w:t>
+      </w:r>
+      <w:r>
+        <w:t>Create integration plugins for standard Learning Management Systems (LMS) like Moodle, Canvas, or Google Classroom to automatically sync attendance and grades.</w:t>
       </w:r>
     </w:p>
     <w:p>
       <w:pPr>
-        <w:pStyle w:val="ListBullet"/>
+        <w:pStyle w:val="Heading1"/>
       </w:pPr>
       <w:r>
-        <w:t>Advanced Modeling: Incorporate behavioral and socio-economic factors.</w:t>
+        <w:t>9. Conclusion &amp; Summary</w:t>
+      </w:r>
+    </w:p>
+    <w:p>
+      <w:r>
+        <w:t>EduTrack AI demonstrates the power of integrating machine learning and data analytics to serve SDG 4 (Quality Education). By converting static student data into actionable early warning indicators, teachers can intervene before performance gaps widen. The capstone showcases a complete full-stack machine learning pipeline from synthetic dataset generation to API-first serving and interactive visualization, offering an scalable, automated approach to supporting student success.</w:t>
       </w:r>
     </w:p>
     <w:sectPr>

</xml_diff>

<commit_message>
fix: robust deployment logic and updated live links in report
</commit_message>
<xml_diff>
--- a/SDG4_EduTrackAI_VijayBarhate.docx
+++ b/SDG4_EduTrackAI_VijayBarhate.docx
@@ -657,7 +657,7 @@
         <w:pStyle w:val="Heading1"/>
       </w:pPr>
       <w:r>
-        <w:t>7. Open Source Repository</w:t>
+        <w:t>7. Open Source Repository &amp; Deployment</w:t>
       </w:r>
     </w:p>
     <w:p>
@@ -669,6 +669,26 @@
       </w:r>
       <w:r>
         <w:t>https://github.com/vijaybarhate/edutrack-ai</w:t>
+        <w:br/>
+      </w:r>
+      <w:r>
+        <w:rPr>
+          <w:b/>
+        </w:rPr>
+        <w:t xml:space="preserve">Live Application: </w:t>
+      </w:r>
+      <w:r>
+        <w:t>https://edutrack-ai-01.streamlit.app</w:t>
+        <w:br/>
+      </w:r>
+      <w:r>
+        <w:rPr>
+          <w:b/>
+        </w:rPr>
+        <w:t xml:space="preserve">Backend API: </w:t>
+      </w:r>
+      <w:r>
+        <w:t>https://edutrack-backend-dsss.onrender.com</w:t>
       </w:r>
     </w:p>
     <w:p>

</xml_diff>